<commit_message>
Sandstone Care Growth Systems Manager: score 84; call tracking and vendor management confirmed
Co-Authored-By: Claude Opus 5.5 <noreply@anthropic.com>
Claude-Session: https://claude.ai/code/session_018DEej5NGjq1omj9BTtvEiy
</commit_message>
<xml_diff>
--- a/applications/sandstone-care-growth-systems-manager/SandstoneCare-GrowthSystemsManager-CoverLetter.docx
+++ b/applications/sandstone-care-growth-systems-manager/SandstoneCare-GrowthSystemsManager-CoverLetter.docx
@@ -94,7 +94,7 @@
           <w:b w:val="0"/>
           <w:color w:val="1A1A1A"/>
         </w:rPr>
-        <w:t>Owning the systems a growth team runs on is the work I do now. At Solenzo I'm the primary administrator for client CRMs in GoHighLevel and HubSpot: pipelines, lifecycle stages, lead qualification, data hygiene, and 20+ automated workflows, including no-show follow-up. I build the integrations myself in n8n, Make, and Zapier with webhooks, REST APIs, and OAuth, and set up GA4 and Google Tag Manager with conversion tracking and consent configuration. Then I train the people who use it and document how it works.</w:t>
+        <w:t>Owning the systems a growth team runs on is the work I do now. At Solenzo I'm the primary administrator for client CRMs in GoHighLevel and HubSpot: pipelines, lifecycle stages, lead qualification, data hygiene, and 20+ automated workflows, including no-show follow-up. I build the integrations myself in n8n, Make, and Zapier with webhooks, REST APIs, and OAuth, set up GA4, Google Tag Manager, and call tracking with conversion events and consent configuration, and manage the vendors behind the stack. Then I train the people who use it and document how it works.</w:t>
       </w:r>
     </w:p>
     <w:p>
@@ -120,7 +120,7 @@
           <w:b w:val="0"/>
           <w:color w:val="1A1A1A"/>
         </w:rPr>
-        <w:t>I haven't administered a healthcare-specific CRM or HIPAA-compliant marketing tools yet, or owned a call tracking platform like CTM, and those are where I'd ramp first. I'm in Colorado. Open to a conversation at 303-726-5037 or jrotnbrg@gmail.com.</w:t>
+        <w:t>I haven't administered a healthcare-specific CRM or HIPAA-compliant marketing tools yet, and that's where I'd ramp first. I'm in Colorado. Open to a conversation at 303-726-5037 or jrotnbrg@gmail.com.</w:t>
       </w:r>
     </w:p>
     <w:p>

</xml_diff>